<commit_message>
Đề cương: chia lại đề mục theo mẫu Khoa, thêm mã lớp
- Nội dung đề tài: 1. Tổng quan (bối cảnh, nghiên cứu liên quan, hạn chế, phát biểu
  bài toán, tính mới, đóng góp, cải tiến), 2. Mục tiêu, 3. Phạm vi, 4. Đối tượng,
  5. Phương pháp thực hiện (Nội dung 1–4), 6. Kết quả mong đợi.
- Kế hoạch thực hiện: 1. Mô tả kế hoạch làm việc (kèm rủi ro và phương án dự phòng),
  2. Thời gian biểu, 3. Phân công công việc; thêm đoạn mô tả kế hoạch và đoạn phân công.
- Dòng sinh viên thêm mã lớp MMTT2023.2.
- Bản chữ đỏ: đề mục mới tô đỏ; đoạn chỉ dời chỗ giữ màu cũ (to_mau_do.py ghép đoạn
  theo chữ giống hệt).

Co-Authored-By: Claude Opus 5.5 <noreply@anthropic.com>
Claude-Session: https://claude.ai/code/session_01XKRR9pxY1FMf1j4UJFC41W
</commit_message>
<xml_diff>
--- a/de_cuong/23521228_BuiLeHuyPhuoc_DeCuongKLTN.docx
+++ b/de_cuong/23521228_BuiLeHuyPhuoc_DeCuongKLTN.docx
@@ -704,7 +704,7 @@
                 <w:szCs w:val="26"/>
                 <w:rtl w:val="0"/>
               </w:rPr>
-              <w:t xml:space="preserve">Bùi Lê Huy Phước – 23521228 - 0373025859</w:t>
+              <w:t xml:space="preserve">Bùi Lê Huy Phước – 23521228 - MMTT2023.2 - 0373025859</w:t>
             </w:r>
           </w:p>
         </w:tc>
@@ -2273,21 +2273,21 @@
       </w:tr>
       <w:tr>
         <w:trPr>
-          <w:cantSplit w:val="1"/>
-          <w:jc w:val="center"/>
-        </w:trPr>
-        <w:tc>
-          <w:tcPr>
-            <w:tcW w:w="9513" w:type="dxa"/>
-            <w:gridSpan w:val="2"/>
-            <w:tcBorders>
-              <w:top w:val="nil"/>
-              <w:bottom w:val="nil"/>
-            </w:tcBorders>
-          </w:tcPr>
-          <w:p>
-            <w:pPr>
-              <w:spacing w:after="80" w:before="160" w:line="278" w:lineRule="auto"/>
+          <w:cantSplit w:val="0"/>
+          <w:jc w:val="center"/>
+        </w:trPr>
+        <w:tc>
+          <w:tcPr>
+            <w:tcW w:w="9513" w:type="dxa"/>
+            <w:gridSpan w:val="2"/>
+            <w:tcBorders>
+              <w:top w:val="nil"/>
+              <w:bottom w:val="nil"/>
+            </w:tcBorders>
+          </w:tcPr>
+          <w:p>
+            <w:pPr>
+              <w:spacing w:after="80" w:line="278" w:lineRule="auto"/>
               <w:ind w:right="102"/>
               <w:jc w:val="both"/>
               <w:rPr>
@@ -2301,29 +2301,14 @@
                 <w:rFonts w:ascii="Times New Roman" w:cs="Times New Roman" w:eastAsia="Times New Roman" w:hAnsi="Times New Roman"/>
                 <w:b w:val="1"/>
                 <w:bCs w:val="1"/>
-                <w:sz w:val="26"/>
-                <w:szCs w:val="26"/>
-                <w:rtl w:val="0"/>
-              </w:rPr>
-              <w:t xml:space="preserve">2. Phát biểu bài toán</w:t>
-            </w:r>
-            <w:r>
-              <w:rPr>
-                <w:rtl w:val="0"/>
-              </w:rPr>
-            </w:r>
-          </w:p>
-          <w:p>
-            <w:pPr>
-              <w:spacing w:after="80" w:line="278" w:lineRule="auto"/>
-              <w:ind w:right="102"/>
-              <w:jc w:val="both"/>
-              <w:rPr>
-                <w:rFonts w:ascii="Times New Roman" w:cs="Times New Roman" w:eastAsia="Times New Roman" w:hAnsi="Times New Roman"/>
-                <w:sz w:val="26"/>
-                <w:szCs w:val="26"/>
-              </w:rPr>
-            </w:pPr>
+                <w:i w:val="1"/>
+                <w:iCs w:val="1"/>
+                <w:sz w:val="26"/>
+                <w:szCs w:val="26"/>
+                <w:rtl w:val="0"/>
+              </w:rPr>
+              <w:t xml:space="preserve">Phát biểu bài toán. </w:t>
+            </w:r>
             <w:r>
               <w:rPr>
                 <w:rFonts w:ascii="Times New Roman" w:cs="Times New Roman" w:eastAsia="Times New Roman" w:hAnsi="Times New Roman"/>
@@ -2734,71 +2719,6 @@
           </w:tcPr>
           <w:p>
             <w:pPr>
-              <w:spacing w:after="80" w:before="160" w:line="278" w:lineRule="auto"/>
-              <w:ind w:right="102"/>
-              <w:jc w:val="both"/>
-              <w:rPr>
-                <w:rFonts w:ascii="Times New Roman" w:cs="Times New Roman" w:eastAsia="Times New Roman" w:hAnsi="Times New Roman"/>
-                <w:sz w:val="26"/>
-                <w:szCs w:val="26"/>
-              </w:rPr>
-            </w:pPr>
-            <w:r>
-              <w:rPr>
-                <w:rFonts w:ascii="Times New Roman" w:cs="Times New Roman" w:eastAsia="Times New Roman" w:hAnsi="Times New Roman"/>
-                <w:b w:val="1"/>
-                <w:bCs w:val="1"/>
-                <w:sz w:val="26"/>
-                <w:szCs w:val="26"/>
-                <w:rtl w:val="0"/>
-              </w:rPr>
-              <w:t xml:space="preserve">3. Tính mới, đóng góp và cải tiến so với các phương pháp kiểm chứng hiện có</w:t>
-            </w:r>
-            <w:r>
-              <w:rPr>
-                <w:rtl w:val="0"/>
-              </w:rPr>
-            </w:r>
-          </w:p>
-          <w:p>
-            <w:pPr>
-              <w:spacing w:after="80" w:line="278" w:lineRule="auto"/>
-              <w:ind w:right="102"/>
-              <w:jc w:val="both"/>
-              <w:rPr>
-                <w:rFonts w:ascii="Times New Roman" w:cs="Times New Roman" w:eastAsia="Times New Roman" w:hAnsi="Times New Roman"/>
-                <w:sz w:val="26"/>
-                <w:szCs w:val="26"/>
-              </w:rPr>
-            </w:pPr>
-            <w:r>
-              <w:rPr>
-                <w:rFonts w:ascii="Times New Roman" w:cs="Times New Roman" w:eastAsia="Times New Roman" w:hAnsi="Times New Roman"/>
-                <w:sz w:val="26"/>
-                <w:szCs w:val="26"/>
-                <w:rtl w:val="0"/>
-              </w:rPr>
-              <w:t xml:space="preserve">Đề tài không xây dựng lại một hệ thống kiểm chứng tổng quát. Nhiều thành phần được dùng lại và không được tính là điểm mới: tách tuyên bố [10], truy hồi BM25 [14], dùng LLM trích thông tin rồi so khớp với dữ liệu gốc [12], kiểm tra con số bằng phép tính thay vì để LLM tự kết luận [9], và nhãn cho tuyên bố đúng nhưng gây hiểu nhầm [3], [4]. Mỗi thông số, ở cả tuyên bố và tài liệu, được biểu diễn thành bộ bảy trường (sản phẩm và phiên bản, bộ phận, thuộc tính, giá trị, đơn vị, điều kiện ràng buộc, kiểu giá trị). Cách biểu diễn này dựa trên lược đồ gán nhãn của MeasEval [15], trong đó mỗi số đo được gắn với đối tượng, thuộc tính được đo và các thông tin cần có để hiểu đúng số đo; đề tài cụ thể hóa phần thông tin này thành sáu loại điều kiện nêu ở phần Phạm vi.</w:t>
-            </w:r>
-          </w:p>
-        </w:tc>
-      </w:tr>
-      <w:tr>
-        <w:trPr>
-          <w:cantSplit w:val="1"/>
-          <w:jc w:val="center"/>
-        </w:trPr>
-        <w:tc>
-          <w:tcPr>
-            <w:tcW w:w="9513" w:type="dxa"/>
-            <w:gridSpan w:val="2"/>
-            <w:tcBorders>
-              <w:top w:val="nil"/>
-              <w:bottom w:val="nil"/>
-            </w:tcBorders>
-          </w:tcPr>
-          <w:p>
-            <w:pPr>
               <w:spacing w:after="80" w:line="278" w:lineRule="auto"/>
               <w:ind w:right="102"/>
               <w:jc w:val="both"/>
@@ -2829,6 +2749,43 @@
           </w:p>
           <w:p>
             <w:pPr>
+              <w:spacing w:after="80" w:line="278" w:lineRule="auto"/>
+              <w:ind w:right="102"/>
+              <w:jc w:val="both"/>
+              <w:rPr>
+                <w:rFonts w:ascii="Times New Roman" w:cs="Times New Roman" w:eastAsia="Times New Roman" w:hAnsi="Times New Roman"/>
+                <w:sz w:val="26"/>
+                <w:szCs w:val="26"/>
+              </w:rPr>
+            </w:pPr>
+            <w:r>
+              <w:rPr>
+                <w:rFonts w:ascii="Times New Roman" w:cs="Times New Roman" w:eastAsia="Times New Roman" w:hAnsi="Times New Roman"/>
+                <w:sz w:val="26"/>
+                <w:szCs w:val="26"/>
+                <w:rtl w:val="0"/>
+              </w:rPr>
+              <w:t xml:space="preserve">Đề tài không xây dựng lại một hệ thống kiểm chứng tổng quát. Nhiều thành phần được dùng lại và không được tính là điểm mới: tách tuyên bố [10], truy hồi BM25 [14], dùng LLM trích thông tin rồi so khớp với dữ liệu gốc [12], kiểm tra con số bằng phép tính thay vì để LLM tự kết luận [9], và nhãn cho tuyên bố đúng nhưng gây hiểu nhầm [3], [4]. Mỗi thông số, ở cả tuyên bố và tài liệu, được biểu diễn thành bộ bảy trường (sản phẩm và phiên bản, bộ phận, thuộc tính, giá trị, đơn vị, điều kiện ràng buộc, kiểu giá trị). Cách biểu diễn này dựa trên lược đồ gán nhãn của MeasEval [15], trong đó mỗi số đo được gắn với đối tượng, thuộc tính được đo và các thông tin cần có để hiểu đúng số đo; đề tài cụ thể hóa phần thông tin này thành sáu loại điều kiện nêu ở phần Phạm vi.</w:t>
+            </w:r>
+          </w:p>
+        </w:tc>
+      </w:tr>
+      <w:tr>
+        <w:trPr>
+          <w:cantSplit w:val="0"/>
+          <w:jc w:val="center"/>
+        </w:trPr>
+        <w:tc>
+          <w:tcPr>
+            <w:tcW w:w="9513" w:type="dxa"/>
+            <w:gridSpan w:val="2"/>
+            <w:tcBorders>
+              <w:top w:val="nil"/>
+              <w:bottom w:val="nil"/>
+            </w:tcBorders>
+          </w:tcPr>
+          <w:p>
+            <w:pPr>
               <w:numPr>
                 <w:ilvl w:val="0"/>
                 <w:numId w:val="103"/>
@@ -3314,7 +3271,7 @@
                 <w:szCs w:val="26"/>
                 <w:rtl w:val="0"/>
               </w:rPr>
-              <w:t xml:space="preserve">Mục tiêu:</w:t>
+              <w:t xml:space="preserve">2. Mục tiêu</w:t>
             </w:r>
             <w:r>
               <w:rPr>
@@ -3474,7 +3431,7 @@
       </w:tr>
       <w:tr>
         <w:trPr>
-          <w:cantSplit w:val="0"/>
+          <w:cantSplit w:val="1"/>
           <w:jc w:val="center"/>
         </w:trPr>
         <w:tc>
@@ -3506,16 +3463,33 @@
                 <w:szCs w:val="26"/>
                 <w:rtl w:val="0"/>
               </w:rPr>
-              <w:t xml:space="preserve">Phạm vi:</w:t>
-            </w:r>
-            <w:r>
-              <w:rPr>
-                <w:rFonts w:ascii="Times New Roman" w:cs="Times New Roman" w:eastAsia="Times New Roman" w:hAnsi="Times New Roman"/>
-                <w:sz w:val="26"/>
-                <w:szCs w:val="26"/>
-                <w:rtl w:val="0"/>
-              </w:rPr>
-              <w:t xml:space="preserve"> Kiểm chứng các tuyên bố về thông số kỹ thuật có điều kiện ràng buộc trong quảng cáo tiếng Việt do LLM tạo về thiết bị điện tử tiêu dùng có tài liệu thông số chính hãng; thực nghiệm giới hạn ở ba nhóm đại diện: điện thoại thông minh, tai nghe không dây và đồng hồ thông minh, tập trung vào sáu nhóm thông số thường được công bố kèm điều kiện: thời lượng pin, dung lượng pin, sạc nhanh, kháng nước và bụi, màn hình (độ sáng, tần số quét) và zoom camera. Hệ thống chỉ sử dụng tài liệu văn bản của đúng sản phẩm làm bằng chứng; nhãn Chưa đủ thông tin nghĩa là không tìm thấy thông tin trong kho tài liệu đã thu thập.</w:t>
+              <w:t xml:space="preserve">3. Phạm vi</w:t>
+            </w:r>
+            <w:r>
+              <w:rPr>
+                <w:rtl w:val="0"/>
+              </w:rPr>
+            </w:r>
+          </w:p>
+          <w:p>
+            <w:pPr>
+              <w:spacing w:after="80" w:line="278" w:lineRule="auto"/>
+              <w:ind w:right="102"/>
+              <w:jc w:val="both"/>
+              <w:rPr>
+                <w:rFonts w:ascii="Times New Roman" w:cs="Times New Roman" w:eastAsia="Times New Roman" w:hAnsi="Times New Roman"/>
+                <w:sz w:val="26"/>
+                <w:szCs w:val="26"/>
+              </w:rPr>
+            </w:pPr>
+            <w:r>
+              <w:rPr>
+                <w:rFonts w:ascii="Times New Roman" w:cs="Times New Roman" w:eastAsia="Times New Roman" w:hAnsi="Times New Roman"/>
+                <w:sz w:val="26"/>
+                <w:szCs w:val="26"/>
+                <w:rtl w:val="0"/>
+              </w:rPr>
+              <w:t xml:space="preserve">Kiểm chứng các tuyên bố về thông số kỹ thuật có điều kiện ràng buộc trong quảng cáo tiếng Việt do LLM tạo về thiết bị điện tử tiêu dùng có tài liệu thông số chính hãng; thực nghiệm giới hạn ở ba nhóm đại diện: điện thoại thông minh, tai nghe không dây và đồng hồ thông minh, tập trung vào sáu nhóm thông số thường được công bố kèm điều kiện: thời lượng pin, dung lượng pin, sạc nhanh, kháng nước và bụi, màn hình (độ sáng, tần số quét) và zoom camera. Hệ thống chỉ sử dụng tài liệu văn bản của đúng sản phẩm làm bằng chứng; nhãn Chưa đủ thông tin nghĩa là không tìm thấy thông tin trong kho tài liệu đã thu thập.</w:t>
             </w:r>
           </w:p>
         </w:tc>
@@ -3768,7 +3742,73 @@
       </w:tr>
       <w:tr>
         <w:trPr>
-          <w:cantSplit w:val="0"/>
+          <w:cantSplit w:val="1"/>
+          <w:jc w:val="center"/>
+        </w:trPr>
+        <w:tc>
+          <w:tcPr>
+            <w:tcW w:w="9513" w:type="dxa"/>
+            <w:gridSpan w:val="2"/>
+            <w:tcBorders>
+              <w:top w:val="nil"/>
+              <w:bottom w:val="nil"/>
+            </w:tcBorders>
+          </w:tcPr>
+          <w:p>
+            <w:pPr>
+              <w:spacing w:after="80" w:before="160" w:line="278" w:lineRule="auto"/>
+              <w:ind w:right="102"/>
+              <w:jc w:val="both"/>
+              <w:rPr>
+                <w:rFonts w:ascii="Times New Roman" w:cs="Times New Roman" w:eastAsia="Times New Roman" w:hAnsi="Times New Roman"/>
+                <w:sz w:val="26"/>
+                <w:szCs w:val="26"/>
+              </w:rPr>
+            </w:pPr>
+            <w:r>
+              <w:rPr>
+                <w:rFonts w:ascii="Times New Roman" w:cs="Times New Roman" w:eastAsia="Times New Roman" w:hAnsi="Times New Roman"/>
+                <w:b w:val="1"/>
+                <w:bCs w:val="1"/>
+                <w:sz w:val="26"/>
+                <w:szCs w:val="26"/>
+                <w:rtl w:val="0"/>
+              </w:rPr>
+              <w:t xml:space="preserve">4. Đối tượng</w:t>
+            </w:r>
+            <w:r>
+              <w:rPr>
+                <w:rtl w:val="0"/>
+              </w:rPr>
+            </w:r>
+          </w:p>
+          <w:p>
+            <w:pPr>
+              <w:keepLines w:val="1"/>
+              <w:spacing w:after="80" w:line="278" w:lineRule="auto"/>
+              <w:ind w:right="102"/>
+              <w:jc w:val="both"/>
+              <w:rPr>
+                <w:rFonts w:ascii="Times New Roman" w:cs="Times New Roman" w:eastAsia="Times New Roman" w:hAnsi="Times New Roman"/>
+                <w:sz w:val="26"/>
+                <w:szCs w:val="26"/>
+              </w:rPr>
+            </w:pPr>
+            <w:r>
+              <w:rPr>
+                <w:rFonts w:ascii="Times New Roman" w:cs="Times New Roman" w:eastAsia="Times New Roman" w:hAnsi="Times New Roman"/>
+                <w:sz w:val="26"/>
+                <w:szCs w:val="26"/>
+                <w:rtl w:val="0"/>
+              </w:rPr>
+              <w:t xml:space="preserve">Các phương pháp kiểm chứng tuyên bố quảng cáo do LLM tạo bằng bằng chứng văn bản, tập trung phát hiện thông số không phù hợp với tài liệu của sản phẩm hoặc phiên bản được quảng cáo, cũng như các thông số được áp dụng sai điều kiện. Dữ liệu nghiên cứu là các tuyên bố về thông số có điều kiện ràng buộc trong quảng cáo tiếng Việt về điện thoại thông minh, tai nghe không dây, đồng hồ thông minh và trang thông số chính hãng tương ứng.</w:t>
+            </w:r>
+          </w:p>
+        </w:tc>
+      </w:tr>
+      <w:tr>
+        <w:trPr>
+          <w:cantSplit w:val="1"/>
           <w:jc w:val="center"/>
         </w:trPr>
         <w:tc>
@@ -3801,34 +3841,14 @@
                 <w:szCs w:val="26"/>
                 <w:rtl w:val="0"/>
               </w:rPr>
-              <w:t xml:space="preserve">Đối tượng:</w:t>
-            </w:r>
-            <w:r>
-              <w:rPr>
-                <w:rFonts w:ascii="Times New Roman" w:cs="Times New Roman" w:eastAsia="Times New Roman" w:hAnsi="Times New Roman"/>
-                <w:sz w:val="26"/>
-                <w:szCs w:val="26"/>
-                <w:rtl w:val="0"/>
-              </w:rPr>
-              <w:t xml:space="preserve"> Các phương pháp kiểm chứng tuyên bố quảng cáo do LLM tạo bằng bằng chứng văn bản, tập trung phát hiện thông số không phù hợp với tài liệu của sản phẩm hoặc phiên bản được quảng cáo, cũng như các thông số được áp dụng sai điều kiện. Dữ liệu nghiên cứu là các tuyên bố về thông số có điều kiện ràng buộc trong quảng cáo tiếng Việt về điện thoại thông minh, tai nghe không dây, đồng hồ thông minh và trang thông số chính hãng tương ứng.</w:t>
-            </w:r>
-          </w:p>
-        </w:tc>
-      </w:tr>
-      <w:tr>
-        <w:trPr>
-          <w:cantSplit w:val="1"/>
-          <w:jc w:val="center"/>
-        </w:trPr>
-        <w:tc>
-          <w:tcPr>
-            <w:tcW w:w="9513" w:type="dxa"/>
-            <w:gridSpan w:val="2"/>
-            <w:tcBorders>
-              <w:top w:val="nil"/>
-              <w:bottom w:val="nil"/>
-            </w:tcBorders>
-          </w:tcPr>
+              <w:t xml:space="preserve">5. Phương pháp thực hiện</w:t>
+            </w:r>
+            <w:r>
+              <w:rPr>
+                <w:rtl w:val="0"/>
+              </w:rPr>
+            </w:r>
+          </w:p>
           <w:p>
             <w:pPr>
               <w:keepLines w:val="1"/>
@@ -3846,35 +3866,8 @@
                 <w:rFonts w:ascii="Times New Roman" w:cs="Times New Roman" w:eastAsia="Times New Roman" w:hAnsi="Times New Roman"/>
                 <w:b w:val="1"/>
                 <w:bCs w:val="1"/>
-                <w:sz w:val="26"/>
-                <w:szCs w:val="26"/>
-                <w:rtl w:val="0"/>
-              </w:rPr>
-              <w:t xml:space="preserve">Phương pháp thực hiện:</w:t>
-            </w:r>
-            <w:r>
-              <w:rPr>
-                <w:rtl w:val="0"/>
-              </w:rPr>
-            </w:r>
-          </w:p>
-          <w:p>
-            <w:pPr>
-              <w:keepLines w:val="1"/>
-              <w:spacing w:after="80" w:before="160" w:line="278" w:lineRule="auto"/>
-              <w:ind w:right="102"/>
-              <w:jc w:val="both"/>
-              <w:rPr>
-                <w:rFonts w:ascii="Times New Roman" w:cs="Times New Roman" w:eastAsia="Times New Roman" w:hAnsi="Times New Roman"/>
-                <w:sz w:val="26"/>
-                <w:szCs w:val="26"/>
-              </w:rPr>
-            </w:pPr>
-            <w:r>
-              <w:rPr>
-                <w:rFonts w:ascii="Times New Roman" w:cs="Times New Roman" w:eastAsia="Times New Roman" w:hAnsi="Times New Roman"/>
-                <w:b w:val="1"/>
-                <w:bCs w:val="1"/>
+                <w:i w:val="1"/>
+                <w:iCs w:val="1"/>
                 <w:sz w:val="26"/>
                 <w:szCs w:val="26"/>
                 <w:rtl w:val="0"/>
@@ -4191,6 +4184,8 @@
                 <w:rFonts w:ascii="Times New Roman" w:cs="Times New Roman" w:eastAsia="Times New Roman" w:hAnsi="Times New Roman"/>
                 <w:b w:val="1"/>
                 <w:bCs w:val="1"/>
+                <w:i w:val="1"/>
+                <w:iCs w:val="1"/>
                 <w:sz w:val="26"/>
                 <w:szCs w:val="26"/>
                 <w:rtl w:val="0"/>
@@ -4560,6 +4555,8 @@
                 <w:rFonts w:ascii="Times New Roman" w:cs="Times New Roman" w:eastAsia="Times New Roman" w:hAnsi="Times New Roman"/>
                 <w:b w:val="1"/>
                 <w:bCs w:val="1"/>
+                <w:i w:val="1"/>
+                <w:iCs w:val="1"/>
                 <w:sz w:val="26"/>
                 <w:szCs w:val="26"/>
                 <w:rtl w:val="0"/>
@@ -5594,6 +5591,8 @@
                 <w:rFonts w:ascii="Times New Roman" w:cs="Times New Roman" w:eastAsia="Times New Roman" w:hAnsi="Times New Roman"/>
                 <w:b w:val="1"/>
                 <w:bCs w:val="1"/>
+                <w:i w:val="1"/>
+                <w:iCs w:val="1"/>
                 <w:sz w:val="26"/>
                 <w:szCs w:val="26"/>
                 <w:rtl w:val="0"/>
@@ -5709,7 +5708,7 @@
                 <w:szCs w:val="26"/>
                 <w:rtl w:val="0"/>
               </w:rPr>
-              <w:t xml:space="preserve">Kết quả mong đợi:</w:t>
+              <w:t xml:space="preserve">6. Kết quả mong đợi</w:t>
             </w:r>
             <w:r>
               <w:rPr>
@@ -5971,6 +5970,71 @@
           </w:p>
           <w:p>
             <w:pPr>
+              <w:spacing w:after="80" w:before="160" w:line="278" w:lineRule="auto"/>
+              <w:ind w:right="102"/>
+              <w:jc w:val="both"/>
+              <w:rPr>
+                <w:rFonts w:ascii="Times New Roman" w:cs="Times New Roman" w:eastAsia="Times New Roman" w:hAnsi="Times New Roman"/>
+                <w:sz w:val="26"/>
+                <w:szCs w:val="26"/>
+              </w:rPr>
+            </w:pPr>
+            <w:r>
+              <w:rPr>
+                <w:rFonts w:ascii="Times New Roman" w:cs="Times New Roman" w:eastAsia="Times New Roman" w:hAnsi="Times New Roman"/>
+                <w:b w:val="1"/>
+                <w:bCs w:val="1"/>
+                <w:sz w:val="26"/>
+                <w:szCs w:val="26"/>
+                <w:rtl w:val="0"/>
+              </w:rPr>
+              <w:t xml:space="preserve">1. Mô tả kế hoạch làm việc</w:t>
+            </w:r>
+            <w:r>
+              <w:rPr>
+                <w:rtl w:val="0"/>
+              </w:rPr>
+            </w:r>
+          </w:p>
+          <w:p>
+            <w:pPr>
+              <w:spacing w:after="80" w:line="278" w:lineRule="auto"/>
+              <w:ind w:right="102"/>
+              <w:jc w:val="both"/>
+              <w:rPr>
+                <w:rFonts w:ascii="Times New Roman" w:cs="Times New Roman" w:eastAsia="Times New Roman" w:hAnsi="Times New Roman"/>
+                <w:sz w:val="26"/>
+                <w:szCs w:val="26"/>
+              </w:rPr>
+            </w:pPr>
+            <w:r>
+              <w:rPr>
+                <w:rFonts w:ascii="Times New Roman" w:cs="Times New Roman" w:eastAsia="Times New Roman" w:hAnsi="Times New Roman"/>
+                <w:sz w:val="26"/>
+                <w:szCs w:val="26"/>
+                <w:rtl w:val="0"/>
+              </w:rPr>
+              <w:t xml:space="preserve">Công việc chia thành bốn giai đoạn theo tháng: tháng 09/2026 khảo sát tài liệu, xây dựng hướng dẫn gán nhãn và chuẩn bị môi trường chạy; tháng 10/2026 làm thử trên 2 mẫu sản phẩm để chốt hướng dẫn nhãn, tệp cấu hình và quy mô dữ liệu; tháng 11/2026 hoàn thiện bộ dữ liệu, cài đặt P và các đối chứng, chọn cấu hình trên tập phát triển; tháng 12/2026 chạy tập kiểm tra cuối, tích hợp vào CopyPro và hoàn thiện khóa luận. Phần lõi bắt buộc được làm trước, phần mở rộng (B4, thử trên máy tính bảng) chỉ làm khi đúng tiến độ. Các mốc kiểm tra với cán bộ hướng dẫn được ghi trong thời gian biểu; rủi ro và phương án dự phòng nêu dưới đây.</w:t>
+            </w:r>
+          </w:p>
+        </w:tc>
+      </w:tr>
+      <w:tr>
+        <w:trPr>
+          <w:cantSplit w:val="1"/>
+          <w:jc w:val="center"/>
+        </w:trPr>
+        <w:tc>
+          <w:tcPr>
+            <w:tcW w:w="9513" w:type="dxa"/>
+            <w:gridSpan w:val="2"/>
+            <w:tcBorders>
+              <w:top w:val="nil"/>
+              <w:bottom w:val="nil"/>
+            </w:tcBorders>
+          </w:tcPr>
+          <w:p>
+            <w:pPr>
               <w:keepLines w:val="1"/>
               <w:spacing w:after="80" w:before="160" w:line="278" w:lineRule="auto"/>
               <w:ind w:right="102"/>
@@ -5984,11 +6048,209 @@
             <w:r>
               <w:rPr>
                 <w:rFonts w:ascii="Times New Roman" w:cs="Times New Roman" w:eastAsia="Times New Roman" w:hAnsi="Times New Roman"/>
-                <w:sz w:val="26"/>
-                <w:szCs w:val="26"/>
-                <w:rtl w:val="0"/>
-              </w:rPr>
-              <w:t xml:space="preserve">Nhóm có 1 thành viên</w:t>
+                <w:b w:val="1"/>
+                <w:bCs w:val="1"/>
+                <w:i w:val="1"/>
+                <w:iCs w:val="1"/>
+                <w:sz w:val="26"/>
+                <w:szCs w:val="26"/>
+                <w:rtl w:val="0"/>
+              </w:rPr>
+              <w:t xml:space="preserve">Rủi ro và phương án dự phòng:</w:t>
+            </w:r>
+            <w:r>
+              <w:rPr>
+                <w:rtl w:val="0"/>
+              </w:rPr>
+            </w:r>
+          </w:p>
+          <w:p>
+            <w:pPr>
+              <w:numPr>
+                <w:ilvl w:val="0"/>
+                <w:numId w:val="103"/>
+              </w:numPr>
+              <w:spacing w:after="80" w:line="278" w:lineRule="auto"/>
+              <w:ind w:left="397" w:right="102" w:hanging="198"/>
+              <w:jc w:val="both"/>
+              <w:rPr>
+                <w:rFonts w:ascii="Times New Roman" w:cs="Times New Roman" w:eastAsia="Times New Roman" w:hAnsi="Times New Roman"/>
+                <w:sz w:val="26"/>
+                <w:szCs w:val="26"/>
+              </w:rPr>
+            </w:pPr>
+            <w:r>
+              <w:rPr>
+                <w:rFonts w:ascii="Times New Roman" w:cs="Times New Roman" w:eastAsia="Times New Roman" w:hAnsi="Times New Roman"/>
+                <w:sz w:val="26"/>
+                <w:szCs w:val="26"/>
+                <w:rtl w:val="0"/>
+              </w:rPr>
+              <w:t xml:space="preserve">Quảng cáo do LLM tạo chứa ít tuyên bố có điều kiện ràng buộc: tăng số bài sinh cho mỗi mẫu và đưa các thông số nổi bật (pin, sạc, kháng nước) vào ô từ khóa như người viết quảng cáo thường làm; tập cặp tối thiểu bảo đảm đủ mẫu cho từng loại lệch điều kiện.</w:t>
+            </w:r>
+          </w:p>
+        </w:tc>
+      </w:tr>
+      <w:tr>
+        <w:trPr>
+          <w:cantSplit w:val="0"/>
+          <w:jc w:val="center"/>
+        </w:trPr>
+        <w:tc>
+          <w:tcPr>
+            <w:tcW w:w="9513" w:type="dxa"/>
+            <w:gridSpan w:val="2"/>
+            <w:tcBorders>
+              <w:top w:val="nil"/>
+              <w:bottom w:val="nil"/>
+            </w:tcBorders>
+          </w:tcPr>
+          <w:p>
+            <w:pPr>
+              <w:numPr>
+                <w:ilvl w:val="0"/>
+                <w:numId w:val="103"/>
+              </w:numPr>
+              <w:spacing w:after="80" w:line="278" w:lineRule="auto"/>
+              <w:ind w:left="397" w:right="102" w:hanging="198"/>
+              <w:jc w:val="both"/>
+              <w:rPr>
+                <w:rFonts w:ascii="Times New Roman" w:cs="Times New Roman" w:eastAsia="Times New Roman" w:hAnsi="Times New Roman"/>
+                <w:sz w:val="26"/>
+                <w:szCs w:val="26"/>
+              </w:rPr>
+            </w:pPr>
+            <w:r>
+              <w:rPr>
+                <w:rFonts w:ascii="Times New Roman" w:cs="Times New Roman" w:eastAsia="Times New Roman" w:hAnsi="Times New Roman"/>
+                <w:sz w:val="26"/>
+                <w:szCs w:val="26"/>
+                <w:rtl w:val="0"/>
+              </w:rPr>
+              <w:t xml:space="preserve">Trang thông số thiếu chú thích điều kiện, hiển thị bằng mã động hoặc ghi không nhất quán: ưu tiên hãng có chú thích đầy đủ, chụp lại trang sau khi hiển thị xong; thông số không có hoặc mâu thuẫn được gán Chưa đủ thông tin và thống kê riêng.</w:t>
+            </w:r>
+          </w:p>
+        </w:tc>
+      </w:tr>
+      <w:tr>
+        <w:trPr>
+          <w:cantSplit w:val="0"/>
+          <w:jc w:val="center"/>
+        </w:trPr>
+        <w:tc>
+          <w:tcPr>
+            <w:tcW w:w="9513" w:type="dxa"/>
+            <w:gridSpan w:val="2"/>
+            <w:tcBorders>
+              <w:top w:val="nil"/>
+              <w:bottom w:val="nil"/>
+            </w:tcBorders>
+          </w:tcPr>
+          <w:p>
+            <w:pPr>
+              <w:numPr>
+                <w:ilvl w:val="0"/>
+                <w:numId w:val="103"/>
+              </w:numPr>
+              <w:spacing w:after="80" w:line="278" w:lineRule="auto"/>
+              <w:ind w:left="397" w:right="102" w:hanging="198"/>
+              <w:jc w:val="both"/>
+              <w:rPr>
+                <w:rFonts w:ascii="Times New Roman" w:cs="Times New Roman" w:eastAsia="Times New Roman" w:hAnsi="Times New Roman"/>
+                <w:sz w:val="26"/>
+                <w:szCs w:val="26"/>
+              </w:rPr>
+            </w:pPr>
+            <w:r>
+              <w:rPr>
+                <w:rFonts w:ascii="Times New Roman" w:cs="Times New Roman" w:eastAsia="Times New Roman" w:hAnsi="Times New Roman"/>
+                <w:sz w:val="26"/>
+                <w:szCs w:val="26"/>
+                <w:rtl w:val="0"/>
+              </w:rPr>
+              <w:t xml:space="preserve">Mô hình bị nhà cung cấp ngừng phục vụ hoặc giới hạn lượt gọi: lưu tên, phiên bản và đầu ra của mọi lần gọi, dùng bộ nhớ đệm; nếu mô hình dùng để kiểm chứng ngừng phục vụ trước khi khóa cấu hình thì chuyển sang mô hình kế nhiệm do nhà cung cấp khuyến nghị và chạy lại trên tập phát triển.</w:t>
+            </w:r>
+          </w:p>
+        </w:tc>
+      </w:tr>
+      <w:tr>
+        <w:trPr>
+          <w:cantSplit w:val="0"/>
+          <w:jc w:val="center"/>
+        </w:trPr>
+        <w:tc>
+          <w:tcPr>
+            <w:tcW w:w="9513" w:type="dxa"/>
+            <w:gridSpan w:val="2"/>
+            <w:tcBorders>
+              <w:top w:val="nil"/>
+              <w:bottom w:val="nil"/>
+            </w:tcBorders>
+          </w:tcPr>
+          <w:p>
+            <w:pPr>
+              <w:numPr>
+                <w:ilvl w:val="0"/>
+                <w:numId w:val="103"/>
+              </w:numPr>
+              <w:spacing w:after="80" w:line="278" w:lineRule="auto"/>
+              <w:ind w:left="397" w:right="102" w:hanging="198"/>
+              <w:jc w:val="both"/>
+              <w:rPr>
+                <w:rFonts w:ascii="Times New Roman" w:cs="Times New Roman" w:eastAsia="Times New Roman" w:hAnsi="Times New Roman"/>
+                <w:sz w:val="26"/>
+                <w:szCs w:val="26"/>
+              </w:rPr>
+            </w:pPr>
+            <w:r>
+              <w:rPr>
+                <w:rFonts w:ascii="Times New Roman" w:cs="Times New Roman" w:eastAsia="Times New Roman" w:hAnsi="Times New Roman"/>
+                <w:sz w:val="26"/>
+                <w:szCs w:val="26"/>
+                <w:rtl w:val="0"/>
+              </w:rPr>
+              <w:t xml:space="preserve">Gán nhãn chậm hoặc không tìm được người gán thứ hai: giảm số tuyên bố từ quảng cáo thông thường nhưng giữ tập cặp tối thiểu và đủ các hãng trong tập kiểm tra; nếu không có người thứ hai thì chỉ báo độ nhất quán khi gán lại và ghi rõ giới hạn này.</w:t>
+            </w:r>
+          </w:p>
+        </w:tc>
+      </w:tr>
+      <w:tr>
+        <w:trPr>
+          <w:cantSplit w:val="0"/>
+          <w:jc w:val="center"/>
+        </w:trPr>
+        <w:tc>
+          <w:tcPr>
+            <w:tcW w:w="9513" w:type="dxa"/>
+            <w:gridSpan w:val="2"/>
+            <w:tcBorders>
+              <w:top w:val="nil"/>
+              <w:bottom w:val="nil"/>
+            </w:tcBorders>
+          </w:tcPr>
+          <w:p>
+            <w:pPr>
+              <w:numPr>
+                <w:ilvl w:val="0"/>
+                <w:numId w:val="103"/>
+              </w:numPr>
+              <w:spacing w:after="80" w:line="278" w:lineRule="auto"/>
+              <w:ind w:left="397" w:right="102" w:hanging="198"/>
+              <w:jc w:val="both"/>
+              <w:rPr>
+                <w:rFonts w:ascii="Times New Roman" w:cs="Times New Roman" w:eastAsia="Times New Roman" w:hAnsi="Times New Roman"/>
+                <w:sz w:val="26"/>
+                <w:szCs w:val="26"/>
+              </w:rPr>
+            </w:pPr>
+            <w:r>
+              <w:rPr>
+                <w:rFonts w:ascii="Times New Roman" w:cs="Times New Roman" w:eastAsia="Times New Roman" w:hAnsi="Times New Roman"/>
+                <w:sz w:val="26"/>
+                <w:szCs w:val="26"/>
+                <w:rtl w:val="0"/>
+              </w:rPr>
+              <w:t xml:space="preserve">Thiếu thời gian: phần lõi bắt buộc gồm bộ dữ liệu, P, B0–B3, P−ĐK, P−NN và tính năng trên CopyPro; phần mở rộng (B4, thử trên máy tính bảng) được bỏ trước; nếu vẫn chậm thì giảm số mẫu mỗi nhóm nhưng giữ đủ ba nhóm trong tập kiểm tra.</w:t>
             </w:r>
           </w:p>
         </w:tc>
@@ -6007,6 +6269,34 @@
               <w:bottom w:val="nil"/>
             </w:tcBorders>
           </w:tcPr>
+          <w:p>
+            <w:pPr>
+              <w:spacing w:after="80" w:before="160" w:line="278" w:lineRule="auto"/>
+              <w:ind w:right="102"/>
+              <w:jc w:val="both"/>
+              <w:rPr>
+                <w:rFonts w:ascii="Times New Roman" w:cs="Times New Roman" w:eastAsia="Times New Roman" w:hAnsi="Times New Roman"/>
+                <w:sz w:val="26"/>
+                <w:szCs w:val="26"/>
+              </w:rPr>
+            </w:pPr>
+            <w:r>
+              <w:rPr>
+                <w:rFonts w:ascii="Times New Roman" w:cs="Times New Roman" w:eastAsia="Times New Roman" w:hAnsi="Times New Roman"/>
+                <w:b w:val="1"/>
+                <w:bCs w:val="1"/>
+                <w:sz w:val="26"/>
+                <w:szCs w:val="26"/>
+                <w:rtl w:val="0"/>
+              </w:rPr>
+              <w:t xml:space="preserve">2. Thời gian biểu</w:t>
+            </w:r>
+            <w:r>
+              <w:rPr>
+                <w:rtl w:val="0"/>
+              </w:rPr>
+            </w:r>
+          </w:p>
           <w:p>
             <w:pPr>
               <w:keepLines w:val="1"/>
@@ -7528,7 +7818,6 @@
           </w:tcPr>
           <w:p>
             <w:pPr>
-              <w:keepLines w:val="1"/>
               <w:spacing w:after="80" w:before="160" w:line="278" w:lineRule="auto"/>
               <w:ind w:right="102"/>
               <w:jc w:val="both"/>
@@ -7547,37 +7836,34 @@
                 <w:szCs w:val="26"/>
                 <w:rtl w:val="0"/>
               </w:rPr>
-              <w:t xml:space="preserve">Rủi ro và phương án dự phòng:</w:t>
-            </w:r>
-            <w:r>
-              <w:rPr>
-                <w:rtl w:val="0"/>
-              </w:rPr>
-            </w:r>
-          </w:p>
-          <w:p>
-            <w:pPr>
-              <w:numPr>
-                <w:ilvl w:val="0"/>
-                <w:numId w:val="103"/>
-              </w:numPr>
-              <w:spacing w:after="80" w:line="278" w:lineRule="auto"/>
-              <w:ind w:left="397" w:right="102" w:hanging="198"/>
-              <w:jc w:val="both"/>
-              <w:rPr>
-                <w:rFonts w:ascii="Times New Roman" w:cs="Times New Roman" w:eastAsia="Times New Roman" w:hAnsi="Times New Roman"/>
-                <w:sz w:val="26"/>
-                <w:szCs w:val="26"/>
-              </w:rPr>
-            </w:pPr>
-            <w:r>
-              <w:rPr>
-                <w:rFonts w:ascii="Times New Roman" w:cs="Times New Roman" w:eastAsia="Times New Roman" w:hAnsi="Times New Roman"/>
-                <w:sz w:val="26"/>
-                <w:szCs w:val="26"/>
-                <w:rtl w:val="0"/>
-              </w:rPr>
-              <w:t xml:space="preserve">Quảng cáo do LLM tạo chứa ít tuyên bố có điều kiện ràng buộc: tăng số bài sinh cho mỗi mẫu và đưa các thông số nổi bật (pin, sạc, kháng nước) vào ô từ khóa như người viết quảng cáo thường làm; tập cặp tối thiểu bảo đảm đủ mẫu cho từng loại lệch điều kiện.</w:t>
+              <w:t xml:space="preserve">3. Phân công công việc</w:t>
+            </w:r>
+            <w:r>
+              <w:rPr>
+                <w:rtl w:val="0"/>
+              </w:rPr>
+            </w:r>
+          </w:p>
+          <w:p>
+            <w:pPr>
+              <w:keepLines w:val="1"/>
+              <w:spacing w:after="80" w:line="278" w:lineRule="auto"/>
+              <w:ind w:right="102"/>
+              <w:jc w:val="both"/>
+              <w:rPr>
+                <w:rFonts w:ascii="Times New Roman" w:cs="Times New Roman" w:eastAsia="Times New Roman" w:hAnsi="Times New Roman"/>
+                <w:sz w:val="26"/>
+                <w:szCs w:val="26"/>
+              </w:rPr>
+            </w:pPr>
+            <w:r>
+              <w:rPr>
+                <w:rFonts w:ascii="Times New Roman" w:cs="Times New Roman" w:eastAsia="Times New Roman" w:hAnsi="Times New Roman"/>
+                <w:sz w:val="26"/>
+                <w:szCs w:val="26"/>
+                <w:rtl w:val="0"/>
+              </w:rPr>
+              <w:t xml:space="preserve">Nhóm có 1 thành viên</w:t>
             </w:r>
           </w:p>
         </w:tc>
@@ -7593,154 +7879,27 @@
             <w:gridSpan w:val="2"/>
             <w:tcBorders>
               <w:top w:val="nil"/>
-              <w:bottom w:val="nil"/>
-            </w:tcBorders>
-          </w:tcPr>
-          <w:p>
-            <w:pPr>
-              <w:numPr>
-                <w:ilvl w:val="0"/>
-                <w:numId w:val="103"/>
-              </w:numPr>
-              <w:spacing w:after="80" w:line="278" w:lineRule="auto"/>
-              <w:ind w:left="397" w:right="102" w:hanging="198"/>
-              <w:jc w:val="both"/>
-              <w:rPr>
-                <w:rFonts w:ascii="Times New Roman" w:cs="Times New Roman" w:eastAsia="Times New Roman" w:hAnsi="Times New Roman"/>
-                <w:sz w:val="26"/>
-                <w:szCs w:val="26"/>
-              </w:rPr>
-            </w:pPr>
-            <w:r>
-              <w:rPr>
-                <w:rFonts w:ascii="Times New Roman" w:cs="Times New Roman" w:eastAsia="Times New Roman" w:hAnsi="Times New Roman"/>
-                <w:sz w:val="26"/>
-                <w:szCs w:val="26"/>
-                <w:rtl w:val="0"/>
-              </w:rPr>
-              <w:t xml:space="preserve">Trang thông số thiếu chú thích điều kiện, hiển thị bằng mã động hoặc ghi không nhất quán: ưu tiên hãng có chú thích đầy đủ, chụp lại trang sau khi hiển thị xong; thông số không có hoặc mâu thuẫn được gán Chưa đủ thông tin và thống kê riêng.</w:t>
-            </w:r>
-          </w:p>
-        </w:tc>
-      </w:tr>
-      <w:tr>
-        <w:trPr>
-          <w:cantSplit w:val="0"/>
-          <w:jc w:val="center"/>
-        </w:trPr>
-        <w:tc>
-          <w:tcPr>
-            <w:tcW w:w="9513" w:type="dxa"/>
-            <w:gridSpan w:val="2"/>
-            <w:tcBorders>
-              <w:top w:val="nil"/>
-              <w:bottom w:val="nil"/>
-            </w:tcBorders>
-          </w:tcPr>
-          <w:p>
-            <w:pPr>
-              <w:numPr>
-                <w:ilvl w:val="0"/>
-                <w:numId w:val="103"/>
-              </w:numPr>
-              <w:spacing w:after="80" w:line="278" w:lineRule="auto"/>
-              <w:ind w:left="397" w:right="102" w:hanging="198"/>
-              <w:jc w:val="both"/>
-              <w:rPr>
-                <w:rFonts w:ascii="Times New Roman" w:cs="Times New Roman" w:eastAsia="Times New Roman" w:hAnsi="Times New Roman"/>
-                <w:sz w:val="26"/>
-                <w:szCs w:val="26"/>
-              </w:rPr>
-            </w:pPr>
-            <w:r>
-              <w:rPr>
-                <w:rFonts w:ascii="Times New Roman" w:cs="Times New Roman" w:eastAsia="Times New Roman" w:hAnsi="Times New Roman"/>
-                <w:sz w:val="26"/>
-                <w:szCs w:val="26"/>
-                <w:rtl w:val="0"/>
-              </w:rPr>
-              <w:t xml:space="preserve">Mô hình bị nhà cung cấp ngừng phục vụ hoặc giới hạn lượt gọi: lưu tên, phiên bản và đầu ra của mọi lần gọi, dùng bộ nhớ đệm; nếu mô hình dùng để kiểm chứng ngừng phục vụ trước khi khóa cấu hình thì chuyển sang mô hình kế nhiệm do nhà cung cấp khuyến nghị và chạy lại trên tập phát triển.</w:t>
-            </w:r>
-          </w:p>
-        </w:tc>
-      </w:tr>
-      <w:tr>
-        <w:trPr>
-          <w:cantSplit w:val="0"/>
-          <w:jc w:val="center"/>
-        </w:trPr>
-        <w:tc>
-          <w:tcPr>
-            <w:tcW w:w="9513" w:type="dxa"/>
-            <w:gridSpan w:val="2"/>
-            <w:tcBorders>
-              <w:top w:val="nil"/>
-              <w:bottom w:val="nil"/>
-            </w:tcBorders>
-          </w:tcPr>
-          <w:p>
-            <w:pPr>
-              <w:numPr>
-                <w:ilvl w:val="0"/>
-                <w:numId w:val="103"/>
-              </w:numPr>
-              <w:spacing w:after="80" w:line="278" w:lineRule="auto"/>
-              <w:ind w:left="397" w:right="102" w:hanging="198"/>
-              <w:jc w:val="both"/>
-              <w:rPr>
-                <w:rFonts w:ascii="Times New Roman" w:cs="Times New Roman" w:eastAsia="Times New Roman" w:hAnsi="Times New Roman"/>
-                <w:sz w:val="26"/>
-                <w:szCs w:val="26"/>
-              </w:rPr>
-            </w:pPr>
-            <w:r>
-              <w:rPr>
-                <w:rFonts w:ascii="Times New Roman" w:cs="Times New Roman" w:eastAsia="Times New Roman" w:hAnsi="Times New Roman"/>
-                <w:sz w:val="26"/>
-                <w:szCs w:val="26"/>
-                <w:rtl w:val="0"/>
-              </w:rPr>
-              <w:t xml:space="preserve">Gán nhãn chậm hoặc không tìm được người gán thứ hai: giảm số tuyên bố từ quảng cáo thông thường nhưng giữ tập cặp tối thiểu và đủ các hãng trong tập kiểm tra; nếu không có người thứ hai thì chỉ báo độ nhất quán khi gán lại và ghi rõ giới hạn này.</w:t>
-            </w:r>
-          </w:p>
-        </w:tc>
-      </w:tr>
-      <w:tr>
-        <w:trPr>
-          <w:cantSplit w:val="0"/>
-          <w:jc w:val="center"/>
-        </w:trPr>
-        <w:tc>
-          <w:tcPr>
-            <w:tcW w:w="9513" w:type="dxa"/>
-            <w:gridSpan w:val="2"/>
-            <w:tcBorders>
-              <w:top w:val="nil"/>
-            </w:tcBorders>
-          </w:tcPr>
-          <w:p>
-            <w:pPr>
-              <w:numPr>
-                <w:ilvl w:val="0"/>
-                <w:numId w:val="103"/>
-              </w:numPr>
-              <w:spacing w:after="80" w:line="278" w:lineRule="auto"/>
-              <w:ind w:left="397" w:right="102" w:hanging="198"/>
-              <w:jc w:val="both"/>
-              <w:rPr>
-                <w:rFonts w:ascii="Times New Roman" w:cs="Times New Roman" w:eastAsia="Times New Roman" w:hAnsi="Times New Roman"/>
-                <w:sz w:val="26"/>
-                <w:szCs w:val="26"/>
-              </w:rPr>
-            </w:pPr>
-            <w:r>
-              <w:rPr>
-                <w:rFonts w:ascii="Times New Roman" w:cs="Times New Roman" w:eastAsia="Times New Roman" w:hAnsi="Times New Roman"/>
-                <w:sz w:val="26"/>
-                <w:szCs w:val="26"/>
-                <w:rtl w:val="0"/>
-              </w:rPr>
-              <w:t xml:space="preserve">Thiếu thời gian: phần lõi bắt buộc gồm bộ dữ liệu, P, B0–B3, P−ĐK, P−NN và tính năng trên CopyPro; phần mở rộng (B4, thử trên máy tính bảng) được bỏ trước; nếu vẫn chậm thì giảm số mẫu mỗi nhóm nhưng giữ đủ ba nhóm trong tập kiểm tra.</w:t>
+            </w:tcBorders>
+          </w:tcPr>
+          <w:p>
+            <w:pPr>
+              <w:spacing w:after="80" w:line="278" w:lineRule="auto"/>
+              <w:ind w:right="102"/>
+              <w:jc w:val="both"/>
+              <w:rPr>
+                <w:rFonts w:ascii="Times New Roman" w:cs="Times New Roman" w:eastAsia="Times New Roman" w:hAnsi="Times New Roman"/>
+                <w:sz w:val="26"/>
+                <w:szCs w:val="26"/>
+              </w:rPr>
+            </w:pPr>
+            <w:r>
+              <w:rPr>
+                <w:rFonts w:ascii="Times New Roman" w:cs="Times New Roman" w:eastAsia="Times New Roman" w:hAnsi="Times New Roman"/>
+                <w:sz w:val="26"/>
+                <w:szCs w:val="26"/>
+                <w:rtl w:val="0"/>
+              </w:rPr>
+              <w:t xml:space="preserve">Sinh viên Bùi Lê Huy Phước thực hiện toàn bộ công việc trong thời gian biểu trên, gồm khảo sát tài liệu, xây dựng và gán nhãn dữ liệu, cài đặt phương pháp P và các đối chứng, chạy thực nghiệm, tích hợp vào CopyPro và viết khóa luận. Người gán nhãn thứ hai chỉ tham gia gán độc lập khoảng 60 tuyên bố để đo độ tin cậy của nhãn.</w:t>
             </w:r>
           </w:p>
         </w:tc>

</xml_diff>

<commit_message>
Đề cương: viết lại phần Tính mới thành danh sách các điểm mới
- Bỏ đoạn dài liệt kê phần dùng lại và đoạn phân biệt với B1, B2; thay bằng 3 điểm mới:
  xét riêng loại tuyên bố thông số có điều kiện (nhãn Lệch điều kiện có quy tắc cụ thể),
  kết luận bằng phép đối chiếu điều kiện (ghi gọn chỗ khác với bước tách điều kiện và B1, B2),
  sáu loại điều kiện làm danh mục so sánh (cụ thể hóa lược đồ MeasEval).
- Định nghĩa bộ bảy trường chuyển vào bước Trích xuất có neo nguồn, thay tham chiếu
  "nêu ở mục 3" đã sai sau khi chia lại đề mục.
- Đánh số lại trích dẫn theo thứ tự xuất hiện (MeasEval [14], VitaminC [15], BM25 [16]).

Co-Authored-By: Claude Opus 5.5 <noreply@anthropic.com>
Claude-Session: https://claude.ai/code/session_01XKRR9pxY1FMf1j4UJFC41W
</commit_message>
<xml_diff>
--- a/de_cuong/23521228_BuiLeHuyPhuoc_DeCuongKLTN.docx
+++ b/de_cuong/23521228_BuiLeHuyPhuoc_DeCuongKLTN.docx
@@ -2749,43 +2749,6 @@
           </w:p>
           <w:p>
             <w:pPr>
-              <w:spacing w:after="80" w:line="278" w:lineRule="auto"/>
-              <w:ind w:right="102"/>
-              <w:jc w:val="both"/>
-              <w:rPr>
-                <w:rFonts w:ascii="Times New Roman" w:cs="Times New Roman" w:eastAsia="Times New Roman" w:hAnsi="Times New Roman"/>
-                <w:sz w:val="26"/>
-                <w:szCs w:val="26"/>
-              </w:rPr>
-            </w:pPr>
-            <w:r>
-              <w:rPr>
-                <w:rFonts w:ascii="Times New Roman" w:cs="Times New Roman" w:eastAsia="Times New Roman" w:hAnsi="Times New Roman"/>
-                <w:sz w:val="26"/>
-                <w:szCs w:val="26"/>
-                <w:rtl w:val="0"/>
-              </w:rPr>
-              <w:t xml:space="preserve">Đề tài không xây dựng lại một hệ thống kiểm chứng tổng quát. Nhiều thành phần được dùng lại và không được tính là điểm mới: tách tuyên bố [10], truy hồi BM25 [14], dùng LLM trích thông tin rồi so khớp với dữ liệu gốc [12], kiểm tra con số bằng phép tính thay vì để LLM tự kết luận [9], và nhãn cho tuyên bố đúng nhưng gây hiểu nhầm [3], [4]. Mỗi thông số, ở cả tuyên bố và tài liệu, được biểu diễn thành bộ bảy trường (sản phẩm và phiên bản, bộ phận, thuộc tính, giá trị, đơn vị, điều kiện ràng buộc, kiểu giá trị). Cách biểu diễn này dựa trên lược đồ gán nhãn của MeasEval [15], trong đó mỗi số đo được gắn với đối tượng, thuộc tính được đo và các thông tin cần có để hiểu đúng số đo; đề tài cụ thể hóa phần thông tin này thành sáu loại điều kiện nêu ở phần Phạm vi.</w:t>
-            </w:r>
-          </w:p>
-        </w:tc>
-      </w:tr>
-      <w:tr>
-        <w:trPr>
-          <w:cantSplit w:val="0"/>
-          <w:jc w:val="center"/>
-        </w:trPr>
-        <w:tc>
-          <w:tcPr>
-            <w:tcW w:w="9513" w:type="dxa"/>
-            <w:gridSpan w:val="2"/>
-            <w:tcBorders>
-              <w:top w:val="nil"/>
-              <w:bottom w:val="nil"/>
-            </w:tcBorders>
-          </w:tcPr>
-          <w:p>
-            <w:pPr>
               <w:numPr>
                 <w:ilvl w:val="0"/>
                 <w:numId w:val="103"/>
@@ -2806,7 +2769,7 @@
                 <w:szCs w:val="26"/>
                 <w:rtl w:val="0"/>
               </w:rPr>
-              <w:t xml:space="preserve">Bước kết luận dựa trên đối chiếu điều kiện: P so điều kiện của tuyên bố (nêu rõ, hoặc theo cách hiểu thông thường) với từng điều kiện mà hãng công bố cho cùng thông số, rồi kết luận Lệch điều kiện khi con số của tuyên bố trùng với giá trị được công bố ở một điều kiện khác, hoặc khi mức “lên đến” bị viết thành mức chắc chắn đạt. Nhờ vậy, lỗi “đúng con số nhưng sai điều kiện” được tách khỏi lỗi sai con số và không bị chấp nhận là Đúng. Hướng nửa sự thật [4] phải tự đoán phần ngữ cảnh bị bỏ; với thông số kỹ thuật, điều kiện đã được hãng ghi sẵn trong tài liệu nên có thể dò và so từng loại.</w:t>
+              <w:t xml:space="preserve">Xét riêng loại tuyên bố thông số có điều kiện ràng buộc trong quảng cáo tiếng Việt do LLM tạo, loại tuyên bố mà các nghiên cứu đã khảo sát chưa xét riêng. Nhãn Lệch điều kiện được định nghĩa bằng quy tắc cụ thể (phần Phát biểu bài toán), để người gán nhãn và hệ thống dùng cùng một tiêu chí.</w:t>
             </w:r>
           </w:p>
         </w:tc>
@@ -2827,23 +2790,68 @@
           </w:tcPr>
           <w:p>
             <w:pPr>
-              <w:spacing w:after="80" w:line="278" w:lineRule="auto"/>
-              <w:ind w:right="102"/>
-              <w:jc w:val="both"/>
-              <w:rPr>
-                <w:rFonts w:ascii="Times New Roman" w:cs="Times New Roman" w:eastAsia="Times New Roman" w:hAnsi="Times New Roman"/>
-                <w:sz w:val="26"/>
-                <w:szCs w:val="26"/>
-              </w:rPr>
-            </w:pPr>
-            <w:r>
-              <w:rPr>
-                <w:rFonts w:ascii="Times New Roman" w:cs="Times New Roman" w:eastAsia="Times New Roman" w:hAnsi="Times New Roman"/>
-                <w:sz w:val="26"/>
-                <w:szCs w:val="26"/>
-                <w:rtl w:val="0"/>
-              </w:rPr>
-              <w:t xml:space="preserve">Điểm mới này khác với hai phần dễ bị nhầm. Thứ nhất, bước tách điều kiện (LLM trích bộ thông số, Python kiểm tra câu trích và dò thêm điều kiện theo tệp cấu hình) chỉ chuẩn bị đầu vào cho bước kết luận. Thứ hai, đối chứng B2 (Bảng 2) cũng dùng bốn nhãn và được hướng dẫn về điều kiện nhưng để LLM tự đọc bằng chứng rồi tự phán đoán, còn đối chứng B1 nhận cùng bộ thông số đã trích như P nhưng vẫn để LLM gán nhãn. So sánh P với B1 và B2 cho biết riêng tác dụng của bước kết luận.</w:t>
+              <w:numPr>
+                <w:ilvl w:val="0"/>
+                <w:numId w:val="103"/>
+              </w:numPr>
+              <w:spacing w:after="80" w:line="278" w:lineRule="auto"/>
+              <w:ind w:left="397" w:right="102" w:hanging="198"/>
+              <w:jc w:val="both"/>
+              <w:rPr>
+                <w:rFonts w:ascii="Times New Roman" w:cs="Times New Roman" w:eastAsia="Times New Roman" w:hAnsi="Times New Roman"/>
+                <w:sz w:val="26"/>
+                <w:szCs w:val="26"/>
+              </w:rPr>
+            </w:pPr>
+            <w:r>
+              <w:rPr>
+                <w:rFonts w:ascii="Times New Roman" w:cs="Times New Roman" w:eastAsia="Times New Roman" w:hAnsi="Times New Roman"/>
+                <w:sz w:val="26"/>
+                <w:szCs w:val="26"/>
+                <w:rtl w:val="0"/>
+              </w:rPr>
+              <w:t xml:space="preserve">Kết luận bằng phép đối chiếu điều kiện: P so điều kiện của tuyên bố (nêu rõ, hoặc theo cách hiểu thông thường) với từng điều kiện mà hãng công bố cho cùng thông số, rồi kết luận Lệch điều kiện khi con số của tuyên bố trùng với giá trị được công bố ở một điều kiện khác, hoặc khi mức “lên đến” bị viết thành mức chắc chắn đạt. Các cách hiện có để LLM tự đọc bằng chứng rồi phán đoán [3], hoặc phải tự đoán phần ngữ cảnh bị bỏ [4]. Điểm mới nằm ở bước kết luận này, không ở bước tách điều kiện (LLM trích, Python kiểm tra câu trích) vốn chỉ chuẩn bị đầu vào; đối chứng B1 nhận cùng bộ thông số đã trích, B2 dùng cùng bốn nhãn, nhưng cả hai đều để LLM gán nhãn (Bảng 2).</w:t>
+            </w:r>
+          </w:p>
+        </w:tc>
+      </w:tr>
+      <w:tr>
+        <w:trPr>
+          <w:cantSplit w:val="0"/>
+          <w:jc w:val="center"/>
+        </w:trPr>
+        <w:tc>
+          <w:tcPr>
+            <w:tcW w:w="9513" w:type="dxa"/>
+            <w:gridSpan w:val="2"/>
+            <w:tcBorders>
+              <w:top w:val="nil"/>
+              <w:bottom w:val="nil"/>
+            </w:tcBorders>
+          </w:tcPr>
+          <w:p>
+            <w:pPr>
+              <w:numPr>
+                <w:ilvl w:val="0"/>
+                <w:numId w:val="103"/>
+              </w:numPr>
+              <w:spacing w:after="80" w:line="278" w:lineRule="auto"/>
+              <w:ind w:left="397" w:right="102" w:hanging="198"/>
+              <w:jc w:val="both"/>
+              <w:rPr>
+                <w:rFonts w:ascii="Times New Roman" w:cs="Times New Roman" w:eastAsia="Times New Roman" w:hAnsi="Times New Roman"/>
+                <w:sz w:val="26"/>
+                <w:szCs w:val="26"/>
+              </w:rPr>
+            </w:pPr>
+            <w:r>
+              <w:rPr>
+                <w:rFonts w:ascii="Times New Roman" w:cs="Times New Roman" w:eastAsia="Times New Roman" w:hAnsi="Times New Roman"/>
+                <w:sz w:val="26"/>
+                <w:szCs w:val="26"/>
+                <w:rtl w:val="0"/>
+              </w:rPr>
+              <w:t xml:space="preserve">Dùng sáu loại điều kiện của thông số (chế độ hoạt động, bộ phận, phụ kiện, điều kiện đo, phiên bản, kiểu giá trị) làm danh mục để so từng loại. Đây là cách cụ thể hóa cho thông số sản phẩm phần thông tin cần có để hiểu đúng một số đo trong lược đồ gán nhãn MeasEval [14].</w:t>
             </w:r>
           </w:p>
         </w:tc>
@@ -2955,7 +2963,7 @@
                 <w:szCs w:val="26"/>
                 <w:rtl w:val="0"/>
               </w:rPr>
-              <w:t xml:space="preserve">Bộ dữ liệu tiếng Việt gồm tuyên bố thông số có điều kiện ràng buộc trong quảng cáo do LLM tạo, gán bốn nhãn kèm đoạn nguồn và lý do, cùng tập cặp tối thiểu theo ý tưởng cặp tương phản của VitaminC [16] để đo riêng từng loại lệch điều kiện.</w:t>
+              <w:t xml:space="preserve">Bộ dữ liệu tiếng Việt gồm tuyên bố thông số có điều kiện ràng buộc trong quảng cáo do LLM tạo, gán bốn nhãn kèm đoạn nguồn và lý do, cùng tập cặp tối thiểu theo ý tưởng cặp tương phản của VitaminC [15] để đo riêng từng loại lệch điều kiện.</w:t>
             </w:r>
           </w:p>
         </w:tc>
@@ -4220,7 +4228,7 @@
                 <w:szCs w:val="26"/>
                 <w:rtl w:val="0"/>
               </w:rPr>
-              <w:t xml:space="preserve">Sử dụng BM25 làm phương pháp truy hồi nền để xếp hạng các đoạn tài liệu theo mức độ liên quan [14]; cách áp dụng BM25 được tham khảo từ giai đoạn đầu trong quy trình truy hồi bằng chứng của Fathom [13]. Chỉ tìm trong tài liệu của mẫu sản phẩm người dùng đã chọn.</w:t>
+              <w:t xml:space="preserve">Sử dụng BM25 làm phương pháp truy hồi nền để xếp hạng các đoạn tài liệu theo mức độ liên quan [16]; cách áp dụng BM25 được tham khảo từ giai đoạn đầu trong quy trình truy hồi bằng chứng của Fathom [13]. Chỉ tìm trong tài liệu của mẫu sản phẩm người dùng đã chọn.</w:t>
             </w:r>
           </w:p>
         </w:tc>
@@ -4261,7 +4269,7 @@
                 <w:szCs w:val="26"/>
                 <w:rtl w:val="0"/>
               </w:rPr>
-              <w:t xml:space="preserve">Trích xuất có neo nguồn: LLM đọc tuyên bố và bằng chứng, điền bảy trường thông số nêu ở mục 3, mỗi trường kèm câu gốc làm căn cứ. Python kiểm tra câu đó có trong văn bản và con số khớp với giá trị đã điền; trường không đạt bị bỏ chứ không đoán. Sau đó Python dò văn bản theo các cụm từ điều kiện ghi trong tệp cấu hình để bổ sung điều kiện LLM bỏ sót; nếu vẫn không xác định được điều kiện thì kết luận Chưa đủ thông tin.</w:t>
+              <w:t xml:space="preserve">Trích xuất có neo nguồn: LLM đọc tuyên bố và bằng chứng, điền bộ bảy trường thông số (sản phẩm và phiên bản, bộ phận, thuộc tính, giá trị, đơn vị, điều kiện ràng buộc, kiểu giá trị), mỗi trường kèm câu gốc làm căn cứ. Python kiểm tra câu đó có trong văn bản và con số khớp với giá trị đã điền; trường không đạt bị bỏ chứ không đoán. Sau đó Python dò văn bản theo các cụm từ điều kiện ghi trong tệp cấu hình để bổ sung điều kiện LLM bỏ sót; nếu vẫn không xác định được điều kiện thì kết luận Chưa đủ thông tin.</w:t>
             </w:r>
           </w:p>
         </w:tc>
@@ -8726,7 +8734,7 @@
                 <w:szCs w:val="26"/>
                 <w:rtl w:val="0"/>
               </w:rPr>
-              <w:t xml:space="preserve">[14] S. Robertson and H. Zaragoza, “The probabilistic relevance framework: BM25 and beyond,” </w:t>
+              <w:t xml:space="preserve">[14] C. Harper, J. Cox, C. Kohler, A. Scerri, R. Daniel Jr., and P. Groth, “SemEval-2021 Task 8: MeasEval – Extracting counts and measurements and their related contexts,” in </w:t>
             </w:r>
             <w:r>
               <w:rPr>
@@ -8737,16 +8745,16 @@
                 <w:szCs w:val="26"/>
                 <w:rtl w:val="0"/>
               </w:rPr>
-              <w:t xml:space="preserve">Foundations and Trends in Information Retrieval</w:t>
-            </w:r>
-            <w:r>
-              <w:rPr>
-                <w:rFonts w:ascii="Times New Roman" w:cs="Times New Roman" w:eastAsia="Times New Roman" w:hAnsi="Times New Roman"/>
-                <w:sz w:val="26"/>
-                <w:szCs w:val="26"/>
-                <w:rtl w:val="0"/>
-              </w:rPr>
-              <w:t xml:space="preserve">, vol. 3, no. 4, pp. 333–389, 2009. https://doi.org/10.1561/1500000019</w:t>
+              <w:t xml:space="preserve">Proceedings of the 15th International Workshop on Semantic Evaluation (SemEval-2021)</w:t>
+            </w:r>
+            <w:r>
+              <w:rPr>
+                <w:rFonts w:ascii="Times New Roman" w:cs="Times New Roman" w:eastAsia="Times New Roman" w:hAnsi="Times New Roman"/>
+                <w:sz w:val="26"/>
+                <w:szCs w:val="26"/>
+                <w:rtl w:val="0"/>
+              </w:rPr>
+              <w:t xml:space="preserve">, 2021, pp. 306–316. https://doi.org/10.18653/v1/2021.semeval-1.38</w:t>
             </w:r>
           </w:p>
         </w:tc>
@@ -8784,7 +8792,7 @@
                 <w:szCs w:val="26"/>
                 <w:rtl w:val="0"/>
               </w:rPr>
-              <w:t xml:space="preserve">[15] C. Harper, J. Cox, C. Kohler, A. Scerri, R. Daniel Jr., and P. Groth, “SemEval-2021 Task 8: MeasEval – Extracting counts and measurements and their related contexts,” in </w:t>
+              <w:t xml:space="preserve">[15] T. Schuster, A. Fisch, and R. Barzilay, “Get your vitamin C! Robust fact verification with contrastive evidence,” in </w:t>
             </w:r>
             <w:r>
               <w:rPr>
@@ -8795,16 +8803,16 @@
                 <w:szCs w:val="26"/>
                 <w:rtl w:val="0"/>
               </w:rPr>
-              <w:t xml:space="preserve">Proceedings of the 15th International Workshop on Semantic Evaluation (SemEval-2021)</w:t>
-            </w:r>
-            <w:r>
-              <w:rPr>
-                <w:rFonts w:ascii="Times New Roman" w:cs="Times New Roman" w:eastAsia="Times New Roman" w:hAnsi="Times New Roman"/>
-                <w:sz w:val="26"/>
-                <w:szCs w:val="26"/>
-                <w:rtl w:val="0"/>
-              </w:rPr>
-              <w:t xml:space="preserve">, 2021, pp. 306–316. https://doi.org/10.18653/v1/2021.semeval-1.38</w:t>
+              <w:t xml:space="preserve">Proceedings of the 2021 Conference of the North American Chapter of the Association for Computational Linguistics: Human Language Technologies (NAACL-HLT)</w:t>
+            </w:r>
+            <w:r>
+              <w:rPr>
+                <w:rFonts w:ascii="Times New Roman" w:cs="Times New Roman" w:eastAsia="Times New Roman" w:hAnsi="Times New Roman"/>
+                <w:sz w:val="26"/>
+                <w:szCs w:val="26"/>
+                <w:rtl w:val="0"/>
+              </w:rPr>
+              <w:t xml:space="preserve">, 2021, pp. 624–643. https://doi.org/10.18653/v1/2021.naacl-main.52</w:t>
             </w:r>
           </w:p>
         </w:tc>
@@ -8842,7 +8850,7 @@
                 <w:szCs w:val="26"/>
                 <w:rtl w:val="0"/>
               </w:rPr>
-              <w:t xml:space="preserve">[16] T. Schuster, A. Fisch, and R. Barzilay, “Get your vitamin C! Robust fact verification with contrastive evidence,” in </w:t>
+              <w:t xml:space="preserve">[16] S. Robertson and H. Zaragoza, “The probabilistic relevance framework: BM25 and beyond,” </w:t>
             </w:r>
             <w:r>
               <w:rPr>
@@ -8853,16 +8861,16 @@
                 <w:szCs w:val="26"/>
                 <w:rtl w:val="0"/>
               </w:rPr>
-              <w:t xml:space="preserve">Proceedings of the 2021 Conference of the North American Chapter of the Association for Computational Linguistics: Human Language Technologies (NAACL-HLT)</w:t>
-            </w:r>
-            <w:r>
-              <w:rPr>
-                <w:rFonts w:ascii="Times New Roman" w:cs="Times New Roman" w:eastAsia="Times New Roman" w:hAnsi="Times New Roman"/>
-                <w:sz w:val="26"/>
-                <w:szCs w:val="26"/>
-                <w:rtl w:val="0"/>
-              </w:rPr>
-              <w:t xml:space="preserve">, 2021, pp. 624–643. https://doi.org/10.18653/v1/2021.naacl-main.52</w:t>
+              <w:t xml:space="preserve">Foundations and Trends in Information Retrieval</w:t>
+            </w:r>
+            <w:r>
+              <w:rPr>
+                <w:rFonts w:ascii="Times New Roman" w:cs="Times New Roman" w:eastAsia="Times New Roman" w:hAnsi="Times New Roman"/>
+                <w:sz w:val="26"/>
+                <w:szCs w:val="26"/>
+                <w:rtl w:val="0"/>
+              </w:rPr>
+              <w:t xml:space="preserve">, vol. 3, no. 4, pp. 333–389, 2009. https://doi.org/10.1561/1500000019</w:t>
             </w:r>
           </w:p>
         </w:tc>

</xml_diff>